<commit_message>
Replace resume downloads with corrected October 6 attachment
</commit_message>
<xml_diff>
--- a/public/TchaasHAlexanderWright_Resume.docx
+++ b/public/TchaasHAlexanderWright_Resume.docx
@@ -508,7 +508,15 @@
           <w:sz w:val="21"/>
           <w:szCs w:val="21"/>
         </w:rPr>
-        <w:t>Delivered a portfolio of projects contributing an estimated $118M in strategic value to FedEx in FY25 and $70.5M in FY26.</w:t>
+        <w:t>Delivered a portfolio of projects contributing an estimated $118M in strategic value to FedEx in FY25</w:t>
+      </w:r>
+      <w:r>
+        <w:rPr>
+          <w:rFonts w:cstheme="minorHAnsi"/>
+          <w:sz w:val="21"/>
+          <w:szCs w:val="21"/>
+        </w:rPr>
+        <w:t>.</w:t>
       </w:r>
     </w:p>
     <w:p>

</xml_diff>